<commit_message>
[Update] Cambio en word
</commit_message>
<xml_diff>
--- a/CE-1114_Ficha_de_presentación_del_proyecto_GarroMoraMax.docx
+++ b/CE-1114_Ficha_de_presentación_del_proyecto_GarroMoraMax.docx
@@ -1224,21 +1224,7 @@
                   <w:rStyle w:val="Hipervnculo"/>
                   <w:lang w:val="es-CR"/>
                 </w:rPr>
-                <w:t>M</w:t>
-              </w:r>
-              <w:r>
-                <w:rPr>
-                  <w:rStyle w:val="Hipervnculo"/>
-                  <w:lang w:val="es-CR"/>
-                </w:rPr>
-                <w:t>a</w:t>
-              </w:r>
-              <w:r>
-                <w:rPr>
-                  <w:rStyle w:val="Hipervnculo"/>
-                  <w:lang w:val="es-CR"/>
-                </w:rPr>
-                <w:t>xgarro22@estudiantec.cr</w:t>
+                <w:t>Maxgarro22@estudiantec.cr</w:t>
               </w:r>
             </w:hyperlink>
           </w:p>
@@ -1974,7 +1960,16 @@
               <w:rPr>
                 <w:lang w:val="es-CR"/>
               </w:rPr>
-              <w:t>Sistema reconocedor de especies de árboles desde vista aérea.</w:t>
+              <w:t xml:space="preserve">Desarrollo de </w:t>
+            </w:r>
+            <w:r>
+              <w:t>s</w:t>
+            </w:r>
+            <w:r>
+              <w:t>istema de reconocimiento de especies arbóreas mediante imágenes aéreas</w:t>
+            </w:r>
+            <w:r>
+              <w:t xml:space="preserve"> y terrestres.</w:t>
             </w:r>
           </w:p>
         </w:tc>
@@ -2021,32 +2016,118 @@
               </w:rPr>
             </w:pPr>
             <w:r>
-              <w:t xml:space="preserve">Este proyecto tiene como objetivo desarrollar un sistema para el conteo e identificación de especies de árboles en zonas boscosas. Dado que no existen </w:t>
+              <w:rPr>
+                <w:lang w:val="es-CR"/>
+              </w:rPr>
+              <w:t xml:space="preserve">Este proyecto propone el desarrollo de un sistema innovador para el conteo automático y la clasificación de especies </w:t>
+            </w:r>
+            <w:r>
+              <w:rPr>
+                <w:lang w:val="es-CR"/>
+              </w:rPr>
+              <w:t>de árboles</w:t>
+            </w:r>
+            <w:r>
+              <w:rPr>
+                <w:lang w:val="es-CR"/>
+              </w:rPr>
+              <w:t xml:space="preserve"> en zonas boscosas, enfrentando la falta de </w:t>
             </w:r>
             <w:proofErr w:type="spellStart"/>
             <w:r>
+              <w:rPr>
+                <w:lang w:val="es-CR"/>
+              </w:rPr>
               <w:t>datasets</w:t>
             </w:r>
             <w:proofErr w:type="spellEnd"/>
             <w:r>
-              <w:t xml:space="preserve"> suficientes para identificar especies desde imágenes aéreas, se plantea un enfoque alternativo: utilizar datos obtenidos desde el suelo, donde sí hay información disponible, para generar un </w:t>
+              <w:rPr>
+                <w:lang w:val="es-CR"/>
+              </w:rPr>
+              <w:t xml:space="preserve"> etiquetados desde imágenes aéreas. Para resolverlo, se plantea un enfoque escalonado: primero, se recopilarán imágenes y coordenadas GPS desde el suelo, utilizando también bases de datos existentes de especies ya identificadas. Luego, estos datos se integrarán con imágenes satelitales o aéreas del mismo entorno, generando así un corpus etiquetado que permitirá el entrenamiento de modelos de aprendizaje automático que puedan extrapolar la información terrestre hacia vistas aéreas.</w:t>
+            </w:r>
+          </w:p>
+          <w:p>
+            <w:pPr>
+              <w:spacing w:before="40" w:after="40"/>
+              <w:jc w:val="both"/>
+              <w:rPr>
+                <w:lang w:val="es-CR"/>
+              </w:rPr>
+            </w:pPr>
+            <w:r>
+              <w:rPr>
+                <w:lang w:val="es-CR"/>
+              </w:rPr>
+              <w:t>La solución tecnológica incluye el uso de algoritmos de visión por computadora entrenados para reconocer patrones visuales desde el suelo y luego aplicarlos a imágenes aéreas. Esta transferencia de conocimiento será validada en zonas mixtas con datos tanto aéreos como terrestres, asegurando la confiabilidad del modelo. La metodología permitirá superar la carencia de datos específicos desde el aire y establecer un marco de trabajo replicable que facilite la creación de inventarios forestales eficientes, precisos y automatizados, con un enfoque práctico y escalable.</w:t>
+            </w:r>
+          </w:p>
+          <w:p>
+            <w:pPr>
+              <w:spacing w:before="40" w:after="40"/>
+              <w:jc w:val="both"/>
+              <w:rPr>
+                <w:lang w:val="es-CR"/>
+              </w:rPr>
+            </w:pPr>
+            <w:r>
+              <w:rPr>
+                <w:lang w:val="es-CR"/>
+              </w:rPr>
+              <w:t xml:space="preserve">Un componente esencial del proyecto es la incorporación de </w:t>
             </w:r>
             <w:proofErr w:type="spellStart"/>
             <w:r>
+              <w:rPr>
+                <w:lang w:val="es-CR"/>
+              </w:rPr>
+              <w:t>TinyML</w:t>
+            </w:r>
+            <w:proofErr w:type="spellEnd"/>
+            <w:r>
+              <w:rPr>
+                <w:lang w:val="es-CR"/>
+              </w:rPr>
+              <w:t xml:space="preserve">, una tecnología que permite ejecutar modelos de aprendizaje automático en dispositivos de bajo consumo como sensores o microcontroladores. Esta capacidad de procesamiento local es ideal para operar en zonas remotas sin conexión a internet, permitiendo la validación en tiempo real de los datos recolectados. Gracias a su eficiencia energética y portabilidad, </w:t>
+            </w:r>
+            <w:proofErr w:type="spellStart"/>
+            <w:r>
+              <w:rPr>
+                <w:lang w:val="es-CR"/>
+              </w:rPr>
+              <w:t>TinyML</w:t>
+            </w:r>
+            <w:proofErr w:type="spellEnd"/>
+            <w:r>
+              <w:rPr>
+                <w:lang w:val="es-CR"/>
+              </w:rPr>
+              <w:t xml:space="preserve"> hace posible que la recolección de datos sea más autónoma, y que incluso drones o cámaras móviles en el campo realicen tareas de clasificación preliminar, mejorando así la calidad del </w:t>
+            </w:r>
+            <w:proofErr w:type="spellStart"/>
+            <w:r>
+              <w:rPr>
+                <w:lang w:val="es-CR"/>
+              </w:rPr>
               <w:t>dataset</w:t>
             </w:r>
             <w:proofErr w:type="spellEnd"/>
             <w:r>
-              <w:t xml:space="preserve"> que permita luego entrenar un modelo que realice la estimación de especies desde imágenes aéreas. Este proceso incluirá el registro en campo (con imágenes desde el suelo y coordenadas GPS) y la construcción del </w:t>
-            </w:r>
-            <w:proofErr w:type="spellStart"/>
-            <w:r>
-              <w:t>dataset</w:t>
-            </w:r>
-            <w:proofErr w:type="spellEnd"/>
-            <w:r>
-              <w:t xml:space="preserve"> para su posterior uso en modelos de clasificación aérea.</w:t>
-            </w:r>
+              <w:rPr>
+                <w:lang w:val="es-CR"/>
+              </w:rPr>
+              <w:t xml:space="preserve"> y optimizando los recursos del proyecto.</w:t>
+            </w:r>
+          </w:p>
+          <w:p>
+            <w:pPr>
+              <w:spacing w:before="40" w:after="40"/>
+              <w:jc w:val="both"/>
+              <w:rPr>
+                <w:lang w:val="es-CR"/>
+              </w:rPr>
+            </w:pPr>
           </w:p>
         </w:tc>
       </w:tr>
@@ -2403,7 +2484,10 @@
               <w:t>16</w:t>
             </w:r>
             <w:r>
-              <w:t xml:space="preserve"> GB </w:t>
+              <w:t xml:space="preserve"> GB</w:t>
+            </w:r>
+            <w:r>
+              <w:t>.</w:t>
             </w:r>
           </w:p>
           <w:p>
@@ -2421,24 +2505,16 @@
             <w:r>
               <w:t>Almacenamiento: 1 TB</w:t>
             </w:r>
+            <w:r>
+              <w:t>.</w:t>
+            </w:r>
           </w:p>
           <w:p>
             <w:pPr>
               <w:spacing w:before="40" w:after="40"/>
             </w:pPr>
             <w:r>
-              <w:rPr>
-                <w:lang w:val="es-CR"/>
-              </w:rPr>
-              <w:t>C</w:t>
-            </w:r>
-            <w:proofErr w:type="spellStart"/>
-            <w:r>
-              <w:t>ámara</w:t>
-            </w:r>
-            <w:proofErr w:type="spellEnd"/>
-            <w:r>
-              <w:t xml:space="preserve"> web: </w:t>
+              <w:t>Teléfono celular:</w:t>
             </w:r>
           </w:p>
           <w:p>
@@ -2451,8 +2527,369 @@
               <w:spacing w:before="40" w:after="40"/>
             </w:pPr>
             <w:r>
+              <w:t xml:space="preserve">Modelo: </w:t>
+            </w:r>
+            <w:r>
+              <w:t>iPhone 11</w:t>
+            </w:r>
+            <w:r>
+              <w:t>.</w:t>
+            </w:r>
+          </w:p>
+          <w:p>
+            <w:pPr>
+              <w:pStyle w:val="Prrafodelista"/>
+              <w:numPr>
+                <w:ilvl w:val="0"/>
+                <w:numId w:val="8"/>
+              </w:numPr>
+              <w:spacing w:before="40" w:after="40"/>
+            </w:pPr>
+            <w:r>
+              <w:t>Sistema Operativo: iOS 18.</w:t>
+            </w:r>
+          </w:p>
+          <w:p>
+            <w:pPr>
+              <w:pStyle w:val="Prrafodelista"/>
+              <w:numPr>
+                <w:ilvl w:val="0"/>
+                <w:numId w:val="8"/>
+              </w:numPr>
+            </w:pPr>
+            <w:r>
+              <w:t xml:space="preserve">GPU: </w:t>
+            </w:r>
+            <w:r>
+              <w:t xml:space="preserve">Chip A13 </w:t>
+            </w:r>
+            <w:proofErr w:type="spellStart"/>
+            <w:r>
+              <w:t>Bionic</w:t>
+            </w:r>
+            <w:proofErr w:type="spellEnd"/>
+            <w:r>
+              <w:t>.</w:t>
+            </w:r>
+          </w:p>
+          <w:p>
+            <w:pPr>
+              <w:pStyle w:val="Prrafodelista"/>
+              <w:numPr>
+                <w:ilvl w:val="0"/>
+                <w:numId w:val="8"/>
+              </w:numPr>
+            </w:pPr>
+            <w:r>
+              <w:lastRenderedPageBreak/>
+              <w:t xml:space="preserve">CPU: </w:t>
+            </w:r>
+            <w:r>
+              <w:t>6 núcleos (2 de rendimiento y 4 de eficiencia)</w:t>
+            </w:r>
+            <w:r>
+              <w:t>.</w:t>
+            </w:r>
+          </w:p>
+          <w:p>
+            <w:pPr>
+              <w:pStyle w:val="Prrafodelista"/>
+              <w:numPr>
+                <w:ilvl w:val="0"/>
+                <w:numId w:val="8"/>
+              </w:numPr>
+              <w:spacing w:before="40" w:after="40"/>
+            </w:pPr>
+            <w:r>
+              <w:t>RAM: 8 GB</w:t>
+            </w:r>
+            <w:r>
+              <w:t>.</w:t>
+            </w:r>
+          </w:p>
+          <w:p>
+            <w:pPr>
+              <w:pStyle w:val="Prrafodelista"/>
+              <w:numPr>
+                <w:ilvl w:val="0"/>
+                <w:numId w:val="8"/>
+              </w:numPr>
+              <w:spacing w:before="40" w:after="40"/>
+            </w:pPr>
+            <w:r>
+              <w:t>Almacenamiento: 64 GB</w:t>
+            </w:r>
+            <w:r>
+              <w:t>.</w:t>
+            </w:r>
+          </w:p>
+          <w:p>
+            <w:pPr>
+              <w:pStyle w:val="Prrafodelista"/>
+              <w:numPr>
+                <w:ilvl w:val="0"/>
+                <w:numId w:val="8"/>
+              </w:numPr>
+              <w:spacing w:before="40" w:after="40"/>
+            </w:pPr>
+            <w:r>
+              <w:t xml:space="preserve">Cámara: </w:t>
+            </w:r>
+            <w:r>
+              <w:t>720p HD a 30 f/s</w:t>
+            </w:r>
+            <w:r>
+              <w:t xml:space="preserve"> (resolución mínima) y </w:t>
+            </w:r>
+            <w:r>
+              <w:t>4K a 30 o 60 f/s</w:t>
+            </w:r>
+            <w:r>
+              <w:t xml:space="preserve"> (resolución máxima)</w:t>
+            </w:r>
+          </w:p>
+          <w:p>
+            <w:pPr>
+              <w:spacing w:before="40" w:after="40"/>
+            </w:pPr>
+            <w:r>
+              <w:t xml:space="preserve">NVIDIA </w:t>
+            </w:r>
+            <w:proofErr w:type="spellStart"/>
+            <w:r>
+              <w:t>Jetson</w:t>
+            </w:r>
+            <w:proofErr w:type="spellEnd"/>
+            <w:r>
+              <w:t xml:space="preserve"> nano:</w:t>
+            </w:r>
+          </w:p>
+          <w:p>
+            <w:pPr>
+              <w:pStyle w:val="Prrafodelista"/>
+              <w:numPr>
+                <w:ilvl w:val="0"/>
+                <w:numId w:val="8"/>
+              </w:numPr>
+              <w:spacing w:before="40" w:after="40"/>
+            </w:pPr>
+            <w:r>
+              <w:t>Modelo: NVIDIA Maxwell™ GPU con 128 núcleos CUDA</w:t>
+            </w:r>
+            <w:r>
+              <w:t>.</w:t>
+            </w:r>
+          </w:p>
+          <w:p>
+            <w:pPr>
+              <w:pStyle w:val="Prrafodelista"/>
+              <w:numPr>
+                <w:ilvl w:val="0"/>
+                <w:numId w:val="8"/>
+              </w:numPr>
+              <w:spacing w:before="40" w:after="40"/>
+              <w:rPr>
+                <w:lang w:val="en-GB"/>
+              </w:rPr>
+            </w:pPr>
+            <w:r>
+              <w:rPr>
+                <w:lang w:val="en-GB"/>
+              </w:rPr>
+              <w:t>CPU: Quad-core ARM Cortex-A57 a 1.43 GHz</w:t>
+            </w:r>
+            <w:r>
+              <w:rPr>
+                <w:lang w:val="en-GB"/>
+              </w:rPr>
+              <w:t>.</w:t>
+            </w:r>
+          </w:p>
+          <w:p>
+            <w:pPr>
+              <w:pStyle w:val="Prrafodelista"/>
+              <w:numPr>
+                <w:ilvl w:val="0"/>
+                <w:numId w:val="8"/>
+              </w:numPr>
+              <w:spacing w:before="40" w:after="40"/>
+              <w:rPr>
+                <w:lang w:val="en-GB"/>
+              </w:rPr>
+            </w:pPr>
+            <w:r>
+              <w:rPr>
+                <w:lang w:val="en-GB"/>
+              </w:rPr>
+              <w:t>Memoria: 4 GB LPDDR4 (25.6 GB/s)</w:t>
+            </w:r>
+            <w:r>
+              <w:rPr>
+                <w:lang w:val="en-GB"/>
+              </w:rPr>
+              <w:t>.</w:t>
+            </w:r>
+          </w:p>
+          <w:p>
+            <w:pPr>
+              <w:pStyle w:val="Prrafodelista"/>
+              <w:numPr>
+                <w:ilvl w:val="0"/>
+                <w:numId w:val="8"/>
+              </w:numPr>
+              <w:spacing w:before="40" w:after="40"/>
+              <w:rPr>
+                <w:lang w:val="en-GB"/>
+              </w:rPr>
+            </w:pPr>
+            <w:proofErr w:type="spellStart"/>
+            <w:r>
+              <w:rPr>
+                <w:lang w:val="en-GB"/>
+              </w:rPr>
+              <w:t>Conectividad</w:t>
+            </w:r>
+            <w:proofErr w:type="spellEnd"/>
+            <w:r>
+              <w:rPr>
+                <w:lang w:val="en-GB"/>
+              </w:rPr>
+              <w:t xml:space="preserve">: </w:t>
+            </w:r>
+            <w:r>
+              <w:rPr>
+                <w:lang w:val="en-GB"/>
+              </w:rPr>
+              <w:t>Bluetooth</w:t>
+            </w:r>
+            <w:r>
+              <w:rPr>
+                <w:lang w:val="en-GB"/>
+              </w:rPr>
+              <w:t xml:space="preserve"> y</w:t>
+            </w:r>
+            <w:r>
+              <w:rPr>
+                <w:lang w:val="en-GB"/>
+              </w:rPr>
+              <w:t xml:space="preserve"> Wi-Fi </w:t>
+            </w:r>
+            <w:r>
+              <w:rPr>
+                <w:lang w:val="en-GB"/>
+              </w:rPr>
+              <w:t xml:space="preserve">no </w:t>
+            </w:r>
+            <w:proofErr w:type="spellStart"/>
+            <w:r>
+              <w:rPr>
+                <w:lang w:val="en-GB"/>
+              </w:rPr>
+              <w:t>integrados</w:t>
+            </w:r>
+            <w:proofErr w:type="spellEnd"/>
+            <w:r>
+              <w:rPr>
+                <w:lang w:val="en-GB"/>
+              </w:rPr>
+              <w:t>, Gigabit Ethernet</w:t>
+            </w:r>
+            <w:r>
+              <w:rPr>
+                <w:lang w:val="en-GB"/>
+              </w:rPr>
+              <w:t>.</w:t>
+            </w:r>
+          </w:p>
+          <w:p>
+            <w:pPr>
+              <w:pStyle w:val="Prrafodelista"/>
+              <w:numPr>
+                <w:ilvl w:val="0"/>
+                <w:numId w:val="8"/>
+              </w:numPr>
+              <w:spacing w:before="40" w:after="40"/>
+              <w:rPr>
+                <w:lang w:val="es-CR"/>
+              </w:rPr>
+            </w:pPr>
+            <w:r>
+              <w:rPr>
+                <w:lang w:val="es-CR"/>
+              </w:rPr>
+              <w:t>Puertos: 4 USB 3.0 tipo A, 1 US</w:t>
+            </w:r>
+            <w:r>
+              <w:rPr>
+                <w:lang w:val="es-CR"/>
+              </w:rPr>
+              <w:t xml:space="preserve">B 2.0 Micro-B (modo dispositivo), 1 HDMI 2.0, 1 DisplayPort 1.2, 1 MIPI CSI-2 (cámara), 1 entrada para microSD (almacenamiento principal del sistema), 1 Puerto GPIO de 40 pines (compatible con Raspberry Pi) y 1 puerto de alimentación DC </w:t>
+            </w:r>
+            <w:proofErr w:type="spellStart"/>
+            <w:r>
+              <w:rPr>
+                <w:lang w:val="es-CR"/>
+              </w:rPr>
+              <w:t>barrel</w:t>
+            </w:r>
+            <w:proofErr w:type="spellEnd"/>
+            <w:r>
+              <w:rPr>
+                <w:lang w:val="es-CR"/>
+              </w:rPr>
+              <w:t xml:space="preserve"> </w:t>
+            </w:r>
+            <w:r>
+              <w:rPr>
+                <w:lang w:val="es-CR"/>
+              </w:rPr>
+              <w:t>Jack (5 V/4 A).</w:t>
+            </w:r>
+          </w:p>
+          <w:p>
+            <w:pPr>
+              <w:spacing w:before="40" w:after="40"/>
+            </w:pPr>
+            <w:r>
+              <w:rPr>
+                <w:lang w:val="es-CR"/>
+              </w:rPr>
+              <w:t>C</w:t>
+            </w:r>
+            <w:proofErr w:type="spellStart"/>
+            <w:r>
+              <w:t>ámara</w:t>
+            </w:r>
+            <w:proofErr w:type="spellEnd"/>
+            <w:r>
+              <w:t xml:space="preserve"> web: </w:t>
+            </w:r>
+          </w:p>
+          <w:p>
+            <w:pPr>
+              <w:pStyle w:val="Prrafodelista"/>
+              <w:numPr>
+                <w:ilvl w:val="0"/>
+                <w:numId w:val="8"/>
+              </w:numPr>
+              <w:spacing w:before="40" w:after="40"/>
+            </w:pPr>
+            <w:r>
               <w:t>Resolución mínima de 720p a 30 FPS.</w:t>
             </w:r>
+          </w:p>
+          <w:p>
+            <w:pPr>
+              <w:spacing w:before="40" w:after="40"/>
+            </w:pPr>
+          </w:p>
+          <w:p>
+            <w:pPr>
+              <w:spacing w:before="40" w:after="40"/>
+              <w:rPr>
+                <w:lang w:val="es-CR"/>
+              </w:rPr>
+            </w:pPr>
           </w:p>
         </w:tc>
       </w:tr>
@@ -2475,6 +2912,7 @@
               <w:rPr>
                 <w:lang w:val="es-CR"/>
               </w:rPr>
+              <w:lastRenderedPageBreak/>
               <w:t>Problema a resolver:</w:t>
             </w:r>
           </w:p>
@@ -2811,7 +3249,7 @@
                   </w:rPr>
                   <w:id w:val="1729267448"/>
                   <w14:checkbox>
-                    <w14:checked w14:val="0"/>
+                    <w14:checked w14:val="1"/>
                     <w14:checkedState w14:val="2612" w14:font="MS Gothic"/>
                     <w14:uncheckedState w14:val="2610" w14:font="MS Gothic"/>
                   </w14:checkbox>
@@ -2835,7 +3273,7 @@
                           <w:sz w:val="20"/>
                           <w:lang w:val="es-CR"/>
                         </w:rPr>
-                        <w:t>☐</w:t>
+                        <w:t>☒</w:t>
                       </w:r>
                     </w:p>
                   </w:tc>
@@ -2894,7 +3332,7 @@
                   </w:rPr>
                   <w:id w:val="1073163424"/>
                   <w14:checkbox>
-                    <w14:checked w14:val="0"/>
+                    <w14:checked w14:val="1"/>
                     <w14:checkedState w14:val="2612" w14:font="MS Gothic"/>
                     <w14:uncheckedState w14:val="2610" w14:font="MS Gothic"/>
                   </w14:checkbox>
@@ -2918,7 +3356,7 @@
                           <w:sz w:val="20"/>
                           <w:lang w:val="es-CR"/>
                         </w:rPr>
-                        <w:t>☐</w:t>
+                        <w:t>☒</w:t>
                       </w:r>
                     </w:p>
                   </w:tc>
@@ -2961,7 +3399,7 @@
                   </w:rPr>
                   <w:id w:val="907038993"/>
                   <w14:checkbox>
-                    <w14:checked w14:val="0"/>
+                    <w14:checked w14:val="1"/>
                     <w14:checkedState w14:val="2612" w14:font="MS Gothic"/>
                     <w14:uncheckedState w14:val="2610" w14:font="MS Gothic"/>
                   </w14:checkbox>
@@ -2985,7 +3423,7 @@
                           <w:sz w:val="20"/>
                           <w:lang w:val="es-CR"/>
                         </w:rPr>
-                        <w:t>☐</w:t>
+                        <w:t>☒</w:t>
                       </w:r>
                     </w:p>
                   </w:tc>
@@ -3238,10 +3676,169 @@
           <w:p>
             <w:pPr>
               <w:spacing w:before="40" w:after="40"/>
-              <w:rPr>
-                <w:lang w:val="es-CR"/>
-              </w:rPr>
-            </w:pPr>
+            </w:pPr>
+            <w:r>
+              <w:rPr>
+                <w:lang w:val="es-CR"/>
+              </w:rPr>
+              <w:t xml:space="preserve">Objetivo general: </w:t>
+            </w:r>
+            <w:r>
+              <w:t xml:space="preserve">Desarrollar un sistema inteligente capaz de contar y clasificar especies </w:t>
+            </w:r>
+            <w:r>
+              <w:t>de árboles</w:t>
+            </w:r>
+            <w:r>
+              <w:t xml:space="preserve"> mediante la recolección de datos terrestres y su integración con imágenes aéreas, utilizando técnicas de aprendizaje automático y tecnologías de bajo consumo como </w:t>
+            </w:r>
+            <w:proofErr w:type="spellStart"/>
+            <w:r>
+              <w:t>TinyML</w:t>
+            </w:r>
+            <w:proofErr w:type="spellEnd"/>
+            <w:r>
+              <w:t>, con el fin de generar un modelo predictivo escalable para inventarios forestales eficientes y automatizados</w:t>
+            </w:r>
+            <w:r>
+              <w:t>.</w:t>
+            </w:r>
+          </w:p>
+          <w:p>
+            <w:pPr>
+              <w:spacing w:before="40" w:after="40"/>
+            </w:pPr>
+          </w:p>
+          <w:p>
+            <w:pPr>
+              <w:spacing w:before="40" w:after="40"/>
+            </w:pPr>
+            <w:r>
+              <w:t>Objetivos específicos:</w:t>
+            </w:r>
+          </w:p>
+          <w:p>
+            <w:pPr>
+              <w:pStyle w:val="Prrafodelista"/>
+              <w:numPr>
+                <w:ilvl w:val="0"/>
+                <w:numId w:val="9"/>
+              </w:numPr>
+              <w:spacing w:before="40" w:after="40"/>
+              <w:rPr>
+                <w:lang w:val="es-CR"/>
+              </w:rPr>
+            </w:pPr>
+            <w:r>
+              <w:rPr>
+                <w:lang w:val="es-CR"/>
+              </w:rPr>
+              <w:t>Diseñar y desarrollar una aplicación móvil que permita a los usuarios capturar imágenes de árboles y registrar automáticamente su ubicación mediante coordenadas GPS.</w:t>
+            </w:r>
+          </w:p>
+          <w:p>
+            <w:pPr>
+              <w:pStyle w:val="Prrafodelista"/>
+              <w:numPr>
+                <w:ilvl w:val="0"/>
+                <w:numId w:val="9"/>
+              </w:numPr>
+              <w:spacing w:before="40" w:after="40"/>
+              <w:rPr>
+                <w:lang w:val="es-CR"/>
+              </w:rPr>
+            </w:pPr>
+            <w:r>
+              <w:rPr>
+                <w:lang w:val="es-CR"/>
+              </w:rPr>
+              <w:t xml:space="preserve">Implementar un </w:t>
+            </w:r>
+            <w:proofErr w:type="spellStart"/>
+            <w:r>
+              <w:rPr>
+                <w:lang w:val="es-CR"/>
+              </w:rPr>
+              <w:t>backend</w:t>
+            </w:r>
+            <w:proofErr w:type="spellEnd"/>
+            <w:r>
+              <w:rPr>
+                <w:lang w:val="es-CR"/>
+              </w:rPr>
+              <w:t xml:space="preserve"> local </w:t>
+            </w:r>
+            <w:r>
+              <w:rPr>
+                <w:lang w:val="es-CR"/>
+              </w:rPr>
+              <w:t>para la aplicación</w:t>
+            </w:r>
+            <w:r>
+              <w:rPr>
+                <w:lang w:val="es-CR"/>
+              </w:rPr>
+              <w:t xml:space="preserve"> móvil que procese las imágenes capturadas y almacene los datos recolectados de manera estructurada para su posterior análisis.</w:t>
+            </w:r>
+          </w:p>
+          <w:p>
+            <w:pPr>
+              <w:pStyle w:val="Prrafodelista"/>
+              <w:numPr>
+                <w:ilvl w:val="0"/>
+                <w:numId w:val="9"/>
+              </w:numPr>
+              <w:spacing w:before="40" w:after="40"/>
+              <w:rPr>
+                <w:lang w:val="es-CR"/>
+              </w:rPr>
+            </w:pPr>
+            <w:r>
+              <w:rPr>
+                <w:lang w:val="es-CR"/>
+              </w:rPr>
+              <w:lastRenderedPageBreak/>
+              <w:t xml:space="preserve">Integrar una red neuronal ligera mediante tecnología </w:t>
+            </w:r>
+            <w:proofErr w:type="spellStart"/>
+            <w:r>
+              <w:rPr>
+                <w:lang w:val="es-CR"/>
+              </w:rPr>
+              <w:t>TinyML</w:t>
+            </w:r>
+            <w:proofErr w:type="spellEnd"/>
+            <w:r>
+              <w:rPr>
+                <w:lang w:val="es-CR"/>
+              </w:rPr>
+              <w:t xml:space="preserve"> capaz de ejecutarse directamente en el celular para identificar preliminarmente la especie del árbol desde la imagen tomada en campo.</w:t>
+            </w:r>
+          </w:p>
+          <w:p>
+            <w:pPr>
+              <w:pStyle w:val="Prrafodelista"/>
+              <w:numPr>
+                <w:ilvl w:val="0"/>
+                <w:numId w:val="9"/>
+              </w:numPr>
+              <w:spacing w:before="40" w:after="40"/>
+              <w:rPr>
+                <w:lang w:val="es-CR"/>
+              </w:rPr>
+            </w:pPr>
+            <w:r>
+              <w:rPr>
+                <w:lang w:val="es-CR"/>
+              </w:rPr>
+              <w:t>Validar la precisión del sistema de identificación mediante pruebas en campo, comparando las predicciones del modelo con datos reales y evaluando su rendimiento en diferentes condiciones ambientales</w:t>
+            </w:r>
+            <w:r>
+              <w:rPr>
+                <w:lang w:val="es-CR"/>
+              </w:rPr>
+              <w:t>.</w:t>
+            </w:r>
           </w:p>
         </w:tc>
       </w:tr>
@@ -3263,6 +3860,7 @@
               <w:rPr>
                 <w:lang w:val="es-CR"/>
               </w:rPr>
+              <w:lastRenderedPageBreak/>
               <w:t>Funciones de</w:t>
             </w:r>
             <w:r>
@@ -3290,6 +3888,9 @@
                 <w:lang w:val="es-CR"/>
               </w:rPr>
             </w:pPr>
+            <w:r>
+              <w:t>Desarrollar, investigar, diseñar, proponer, planificar, documentar.</w:t>
+            </w:r>
           </w:p>
           <w:p>
             <w:pPr>
@@ -3320,7 +3921,6 @@
               <w:rPr>
                 <w:lang w:val="es-CR"/>
               </w:rPr>
-              <w:lastRenderedPageBreak/>
               <w:t>Entregables esperados:</w:t>
             </w:r>
           </w:p>
@@ -3331,11 +3931,79 @@
           </w:tcPr>
           <w:p>
             <w:pPr>
+              <w:pStyle w:val="Prrafodelista"/>
+              <w:numPr>
+                <w:ilvl w:val="0"/>
+                <w:numId w:val="8"/>
+              </w:numPr>
               <w:spacing w:before="40" w:after="40"/>
               <w:rPr>
                 <w:lang w:val="es-CR"/>
               </w:rPr>
             </w:pPr>
+            <w:r>
+              <w:rPr>
+                <w:lang w:val="es-CR"/>
+              </w:rPr>
+              <w:t>Repositorio</w:t>
+            </w:r>
+          </w:p>
+          <w:p>
+            <w:pPr>
+              <w:pStyle w:val="Prrafodelista"/>
+              <w:numPr>
+                <w:ilvl w:val="0"/>
+                <w:numId w:val="8"/>
+              </w:numPr>
+              <w:spacing w:before="40" w:after="40"/>
+              <w:rPr>
+                <w:lang w:val="es-CR"/>
+              </w:rPr>
+            </w:pPr>
+            <w:r>
+              <w:rPr>
+                <w:lang w:val="es-CR"/>
+              </w:rPr>
+              <w:t>Manual de usuario</w:t>
+            </w:r>
+          </w:p>
+          <w:p>
+            <w:pPr>
+              <w:pStyle w:val="Prrafodelista"/>
+              <w:numPr>
+                <w:ilvl w:val="0"/>
+                <w:numId w:val="8"/>
+              </w:numPr>
+              <w:spacing w:before="40" w:after="40"/>
+              <w:rPr>
+                <w:lang w:val="es-CR"/>
+              </w:rPr>
+            </w:pPr>
+            <w:r>
+              <w:rPr>
+                <w:lang w:val="es-CR"/>
+              </w:rPr>
+              <w:t>Documento de requerimientos</w:t>
+            </w:r>
+          </w:p>
+          <w:p>
+            <w:pPr>
+              <w:pStyle w:val="Prrafodelista"/>
+              <w:numPr>
+                <w:ilvl w:val="0"/>
+                <w:numId w:val="8"/>
+              </w:numPr>
+              <w:spacing w:before="40" w:after="40"/>
+              <w:rPr>
+                <w:lang w:val="es-CR"/>
+              </w:rPr>
+            </w:pPr>
+            <w:r>
+              <w:rPr>
+                <w:lang w:val="es-CR"/>
+              </w:rPr>
+              <w:t>Plan de proyecto</w:t>
+            </w:r>
           </w:p>
         </w:tc>
       </w:tr>
@@ -3386,6 +4054,12 @@
                 <w:lang w:val="es-CR"/>
               </w:rPr>
             </w:pPr>
+            <w:r>
+              <w:rPr>
+                <w:lang w:val="es-CR"/>
+              </w:rPr>
+              <w:t>N/A</w:t>
+            </w:r>
           </w:p>
           <w:p>
             <w:pPr>
@@ -3454,6 +4128,12 @@
                 <w:lang w:val="es-CR"/>
               </w:rPr>
             </w:pPr>
+            <w:r>
+              <w:rPr>
+                <w:lang w:val="es-CR"/>
+              </w:rPr>
+              <w:t>8 de Agosto del 2025</w:t>
+            </w:r>
           </w:p>
         </w:tc>
       </w:tr>
@@ -3508,6 +4188,12 @@
                 <w:lang w:val="es-CR"/>
               </w:rPr>
             </w:pPr>
+            <w:r>
+              <w:rPr>
+                <w:lang w:val="es-CR"/>
+              </w:rPr>
+              <w:t>14 semanas.</w:t>
+            </w:r>
           </w:p>
         </w:tc>
       </w:tr>
@@ -3580,6 +4266,30 @@
                 <w:lang w:val="es-CR"/>
               </w:rPr>
             </w:pPr>
+            <w:r>
+              <w:rPr>
+                <w:lang w:val="es-CR"/>
+              </w:rPr>
+              <w:t>Se va a trabajar e</w:t>
+            </w:r>
+            <w:r>
+              <w:rPr>
+                <w:lang w:val="es-CR"/>
+              </w:rPr>
+              <w:t>n equipo</w:t>
+            </w:r>
+            <w:r>
+              <w:rPr>
+                <w:lang w:val="es-CR"/>
+              </w:rPr>
+              <w:t xml:space="preserve"> de 2 personas</w:t>
+            </w:r>
+            <w:r>
+              <w:rPr>
+                <w:lang w:val="es-CR"/>
+              </w:rPr>
+              <w:t xml:space="preserve"> con funciones por separado.</w:t>
+            </w:r>
           </w:p>
         </w:tc>
       </w:tr>
@@ -4662,6 +5372,95 @@
     </w:lvl>
   </w:abstractNum>
   <w:abstractNum w:abstractNumId="2" w15:restartNumberingAfterBreak="0">
+    <w:nsid w:val="1A5306D8"/>
+    <w:multiLevelType w:val="hybridMultilevel"/>
+    <w:tmpl w:val="A6A0F8E8"/>
+    <w:lvl w:ilvl="0" w:tplc="0809000F">
+      <w:start w:val="1"/>
+      <w:numFmt w:val="decimal"/>
+      <w:lvlText w:val="%1."/>
+      <w:lvlJc w:val="left"/>
+      <w:pPr>
+        <w:ind w:left="720" w:hanging="360"/>
+      </w:pPr>
+      <w:rPr>
+        <w:rFonts w:hint="default"/>
+      </w:rPr>
+    </w:lvl>
+    <w:lvl w:ilvl="1" w:tplc="08090019" w:tentative="1">
+      <w:start w:val="1"/>
+      <w:numFmt w:val="lowerLetter"/>
+      <w:lvlText w:val="%2."/>
+      <w:lvlJc w:val="left"/>
+      <w:pPr>
+        <w:ind w:left="1440" w:hanging="360"/>
+      </w:pPr>
+    </w:lvl>
+    <w:lvl w:ilvl="2" w:tplc="0809001B" w:tentative="1">
+      <w:start w:val="1"/>
+      <w:numFmt w:val="lowerRoman"/>
+      <w:lvlText w:val="%3."/>
+      <w:lvlJc w:val="right"/>
+      <w:pPr>
+        <w:ind w:left="2160" w:hanging="180"/>
+      </w:pPr>
+    </w:lvl>
+    <w:lvl w:ilvl="3" w:tplc="0809000F" w:tentative="1">
+      <w:start w:val="1"/>
+      <w:numFmt w:val="decimal"/>
+      <w:lvlText w:val="%4."/>
+      <w:lvlJc w:val="left"/>
+      <w:pPr>
+        <w:ind w:left="2880" w:hanging="360"/>
+      </w:pPr>
+    </w:lvl>
+    <w:lvl w:ilvl="4" w:tplc="08090019" w:tentative="1">
+      <w:start w:val="1"/>
+      <w:numFmt w:val="lowerLetter"/>
+      <w:lvlText w:val="%5."/>
+      <w:lvlJc w:val="left"/>
+      <w:pPr>
+        <w:ind w:left="3600" w:hanging="360"/>
+      </w:pPr>
+    </w:lvl>
+    <w:lvl w:ilvl="5" w:tplc="0809001B" w:tentative="1">
+      <w:start w:val="1"/>
+      <w:numFmt w:val="lowerRoman"/>
+      <w:lvlText w:val="%6."/>
+      <w:lvlJc w:val="right"/>
+      <w:pPr>
+        <w:ind w:left="4320" w:hanging="180"/>
+      </w:pPr>
+    </w:lvl>
+    <w:lvl w:ilvl="6" w:tplc="0809000F" w:tentative="1">
+      <w:start w:val="1"/>
+      <w:numFmt w:val="decimal"/>
+      <w:lvlText w:val="%7."/>
+      <w:lvlJc w:val="left"/>
+      <w:pPr>
+        <w:ind w:left="5040" w:hanging="360"/>
+      </w:pPr>
+    </w:lvl>
+    <w:lvl w:ilvl="7" w:tplc="08090019" w:tentative="1">
+      <w:start w:val="1"/>
+      <w:numFmt w:val="lowerLetter"/>
+      <w:lvlText w:val="%8."/>
+      <w:lvlJc w:val="left"/>
+      <w:pPr>
+        <w:ind w:left="5760" w:hanging="360"/>
+      </w:pPr>
+    </w:lvl>
+    <w:lvl w:ilvl="8" w:tplc="0809001B" w:tentative="1">
+      <w:start w:val="1"/>
+      <w:numFmt w:val="lowerRoman"/>
+      <w:lvlText w:val="%9."/>
+      <w:lvlJc w:val="right"/>
+      <w:pPr>
+        <w:ind w:left="6480" w:hanging="180"/>
+      </w:pPr>
+    </w:lvl>
+  </w:abstractNum>
+  <w:abstractNum w:abstractNumId="3" w15:restartNumberingAfterBreak="0">
     <w:nsid w:val="414D617B"/>
     <w:multiLevelType w:val="hybridMultilevel"/>
     <w:tmpl w:val="0DACE87C"/>
@@ -4774,7 +5573,7 @@
       </w:rPr>
     </w:lvl>
   </w:abstractNum>
-  <w:abstractNum w:abstractNumId="3" w15:restartNumberingAfterBreak="0">
+  <w:abstractNum w:abstractNumId="4" w15:restartNumberingAfterBreak="0">
     <w:nsid w:val="4624136F"/>
     <w:multiLevelType w:val="multilevel"/>
     <w:tmpl w:val="C4662718"/>
@@ -4906,7 +5705,7 @@
       </w:rPr>
     </w:lvl>
   </w:abstractNum>
-  <w:abstractNum w:abstractNumId="4" w15:restartNumberingAfterBreak="0">
+  <w:abstractNum w:abstractNumId="5" w15:restartNumberingAfterBreak="0">
     <w:nsid w:val="6E6C759E"/>
     <w:multiLevelType w:val="hybridMultilevel"/>
     <w:tmpl w:val="DF74E794"/>
@@ -5025,7 +5824,7 @@
       </w:pPr>
     </w:lvl>
   </w:abstractNum>
-  <w:abstractNum w:abstractNumId="5" w15:restartNumberingAfterBreak="0">
+  <w:abstractNum w:abstractNumId="6" w15:restartNumberingAfterBreak="0">
     <w:nsid w:val="730D7B84"/>
     <w:multiLevelType w:val="hybridMultilevel"/>
     <w:tmpl w:val="7B922776"/>
@@ -5114,7 +5913,7 @@
       </w:pPr>
     </w:lvl>
   </w:abstractNum>
-  <w:abstractNum w:abstractNumId="6" w15:restartNumberingAfterBreak="0">
+  <w:abstractNum w:abstractNumId="7" w15:restartNumberingAfterBreak="0">
     <w:nsid w:val="785F15B1"/>
     <w:multiLevelType w:val="hybridMultilevel"/>
     <w:tmpl w:val="0B7ABA4C"/>
@@ -5237,19 +6036,22 @@
     <w:abstractNumId w:val="0"/>
   </w:num>
   <w:num w:numId="4" w16cid:durableId="53162198">
+    <w:abstractNumId w:val="4"/>
+  </w:num>
+  <w:num w:numId="5" w16cid:durableId="1218207650">
+    <w:abstractNumId w:val="5"/>
+  </w:num>
+  <w:num w:numId="6" w16cid:durableId="1396851343">
+    <w:abstractNumId w:val="6"/>
+  </w:num>
+  <w:num w:numId="7" w16cid:durableId="1557816924">
     <w:abstractNumId w:val="3"/>
   </w:num>
-  <w:num w:numId="5" w16cid:durableId="1218207650">
-    <w:abstractNumId w:val="4"/>
+  <w:num w:numId="8" w16cid:durableId="962736955">
+    <w:abstractNumId w:val="7"/>
   </w:num>
-  <w:num w:numId="6" w16cid:durableId="1396851343">
-    <w:abstractNumId w:val="5"/>
-  </w:num>
-  <w:num w:numId="7" w16cid:durableId="1557816924">
+  <w:num w:numId="9" w16cid:durableId="653606550">
     <w:abstractNumId w:val="2"/>
-  </w:num>
-  <w:num w:numId="8" w16cid:durableId="962736955">
-    <w:abstractNumId w:val="6"/>
   </w:num>
 </w:numbering>
 </file>

</xml_diff>